<commit_message>
[scholar] rewrite Learning Memo 2 to the actual Week 2 prompt
The posted assignment is not an open reflection. It asks two specific
questions: name the four philosophical assumptions (ontological,
epistemological, axiological, methodological) a chosen qualitative
article makes, and identify its interpretive framework from
post-positivism, social constructivism, or pragmatism, inferring both
where the article does not state them.

Rewritten against Gioia & Chittipeddi (1991), a Week 1 assigned
reading. Reads the insider/outsider design as the epistemological and
axiological claim, and argues the article is constructivist in ontology
while running post-positivist procedural discipline underneath — a
mixture Table 2.2 does not accommodate cleanly. 508 words, one page.
</commit_message>
<xml_diff>
--- a/dba/coursework/GEB7911_Qualitative_Research_Methods/Malik_GEB7911_LearningMemo2.docx
+++ b/dba/coursework/GEB7911_Qualitative_Research_Methods/Malik_GEB7911_LearningMemo2.docx
@@ -68,7 +68,7 @@
           <w:color w:val="14171C"/>
           <w:sz w:val="30"/>
         </w:rPr>
-        <w:t>Learning Memo 2 — Assumptions, Frameworks, and Design</w:t>
+        <w:t>Learning Memo 2 — Philosophical Assumptions and Interpretive Framework</w:t>
       </w:r>
     </w:p>
     <w:p>
@@ -85,7 +85,7 @@
           <w:sz w:val="16"/>
           <w:spacing w:val="22"/>
         </w:rPr>
-        <w:t>Yasir A. Malik  ·  GEB 7911 Qualitative Research Methods  ·  Dr. Cristina Gonzalez  ·  24 August 2026</w:t>
+        <w:t>Yasir A. Malik  ·  GEB 7911  ·  Dr. Cristina Gonzalez  ·  24 August 2026</w:t>
       </w:r>
     </w:p>
     <w:p>
@@ -101,7 +101,157 @@
           <w:color w:val="14171C"/>
           <w:sz w:val="23"/>
         </w:rPr>
-        <w:t>Last week I wrote that my qualifying study failed because I had matched the wrong method to my question. Chapter 2 has made me revise that. The method was not the first mistake. The assumptions underneath it were, and I never made them — I inherited them.</w:t>
+        <w:t>Gioia and Chittipeddi never state their philosophical assumptions. Working them out from the article is what taught me something, because I had to reason backwards from design choices to the commitments those choices imply — which is the exercise I never performed on my own study.</w:t>
+      </w:r>
+    </w:p>
+    <w:p>
+      <w:pPr>
+        <w:spacing w:after="180" w:line="276" w:lineRule="auto"/>
+        <w:jc w:val="both"/>
+      </w:pPr>
+      <w:r>
+        <w:rPr>
+          <w:rFonts w:ascii="Georgia" w:hAnsi="Georgia" w:cs="Georgia"/>
+          <w:b/>
+          <w:i w:val="0"/>
+          <w:color w:val="14171C"/>
+          <w:sz w:val="23"/>
+        </w:rPr>
+        <w:t>Ontological.</w:t>
+      </w:r>
+      <w:r>
+        <w:rPr>
+          <w:rFonts w:ascii="Georgia" w:hAnsi="Georgia" w:cs="Georgia"/>
+          <w:b w:val="0"/>
+          <w:i w:val="0"/>
+          <w:color w:val="14171C"/>
+          <w:sz w:val="23"/>
+        </w:rPr>
+        <w:t xml:space="preserve"> They treat reality as multiple and participant-constructed. The strategic change they follow is not an event with one correct description; it exists as the president's vision, the deans' readings of that vision, and the faculty's readings of the deans — several realities in play at once. A single-reality assumption would have made the divergence between those accounts measurement error to be minimised. Here the divergence </w:t>
+      </w:r>
+      <w:r>
+        <w:rPr>
+          <w:rFonts w:ascii="Georgia" w:hAnsi="Georgia" w:cs="Georgia"/>
+          <w:b w:val="0"/>
+          <w:i/>
+          <w:color w:val="14171C"/>
+          <w:sz w:val="23"/>
+        </w:rPr>
+        <w:t>is</w:t>
+      </w:r>
+      <w:r>
+        <w:rPr>
+          <w:rFonts w:ascii="Georgia" w:hAnsi="Georgia" w:cs="Georgia"/>
+          <w:b w:val="0"/>
+          <w:i w:val="0"/>
+          <w:color w:val="14171C"/>
+          <w:sz w:val="23"/>
+        </w:rPr>
+        <w:t xml:space="preserve"> the finding.</w:t>
+      </w:r>
+    </w:p>
+    <w:p>
+      <w:pPr>
+        <w:spacing w:after="180" w:line="276" w:lineRule="auto"/>
+        <w:jc w:val="both"/>
+      </w:pPr>
+      <w:r>
+        <w:rPr>
+          <w:rFonts w:ascii="Georgia" w:hAnsi="Georgia" w:cs="Georgia"/>
+          <w:b/>
+          <w:i w:val="0"/>
+          <w:color w:val="14171C"/>
+          <w:sz w:val="23"/>
+        </w:rPr>
+        <w:t>Epistemological.</w:t>
+      </w:r>
+      <w:r>
+        <w:rPr>
+          <w:rFonts w:ascii="Georgia" w:hAnsi="Georgia" w:cs="Georgia"/>
+          <w:b w:val="0"/>
+          <w:i w:val="0"/>
+          <w:color w:val="14171C"/>
+          <w:sz w:val="23"/>
+        </w:rPr>
+        <w:t xml:space="preserve"> Knowledge is produced by proximity, and they engineer proximity deliberately. One author was embedded on site as a participant-observer over an extended period; the other was kept away from direct contact. That arrangement is an epistemological claim: closeness is what generates understanding, and it is also what threatens it, so the research team is built to hold both positions at once. I find this the most instructive design decision in the paper.</w:t>
+      </w:r>
+    </w:p>
+    <w:p>
+      <w:pPr>
+        <w:spacing w:after="180" w:line="276" w:lineRule="auto"/>
+        <w:jc w:val="both"/>
+      </w:pPr>
+      <w:r>
+        <w:rPr>
+          <w:rFonts w:ascii="Georgia" w:hAnsi="Georgia" w:cs="Georgia"/>
+          <w:b/>
+          <w:i w:val="0"/>
+          <w:color w:val="14171C"/>
+          <w:sz w:val="23"/>
+        </w:rPr>
+        <w:t>Axiological.</w:t>
+      </w:r>
+      <w:r>
+        <w:rPr>
+          <w:rFonts w:ascii="Georgia" w:hAnsi="Georgia" w:cs="Georgia"/>
+          <w:b w:val="0"/>
+          <w:i w:val="0"/>
+          <w:color w:val="14171C"/>
+          <w:sz w:val="23"/>
+        </w:rPr>
+        <w:t xml:space="preserve"> Values are acknowledged rather than controlled away. The insider/outsider split functions as a reflexivity mechanism — instead of asserting neutrality, they install a colleague whose job is to interrogate the insider's interpretations. Bias is treated as a condition to be managed in the open.</w:t>
+      </w:r>
+    </w:p>
+    <w:p>
+      <w:pPr>
+        <w:spacing w:after="180" w:line="276" w:lineRule="auto"/>
+        <w:jc w:val="both"/>
+      </w:pPr>
+      <w:r>
+        <w:rPr>
+          <w:rFonts w:ascii="Georgia" w:hAnsi="Georgia" w:cs="Georgia"/>
+          <w:b/>
+          <w:i w:val="0"/>
+          <w:color w:val="14171C"/>
+          <w:sz w:val="23"/>
+        </w:rPr>
+        <w:t>Methodological.</w:t>
+      </w:r>
+      <w:r>
+        <w:rPr>
+          <w:rFonts w:ascii="Georgia" w:hAnsi="Georgia" w:cs="Georgia"/>
+          <w:b w:val="0"/>
+          <w:i w:val="0"/>
+          <w:color w:val="14171C"/>
+          <w:sz w:val="23"/>
+        </w:rPr>
+        <w:t xml:space="preserve"> Inductive and emergent. They work from first-order informant terms up to second-order theoretical constructs, and the design moves across two phases as understanding develops rather than being fixed in advance. The sensemaking–sensegiving cycle is an output of that process, not a proposition tested by it.</w:t>
+      </w:r>
+    </w:p>
+    <w:p>
+      <w:pPr>
+        <w:spacing w:after="180" w:line="276" w:lineRule="auto"/>
+        <w:jc w:val="both"/>
+      </w:pPr>
+      <w:r>
+        <w:rPr>
+          <w:rFonts w:ascii="Georgia" w:hAnsi="Georgia" w:cs="Georgia"/>
+          <w:b/>
+          <w:i w:val="0"/>
+          <w:color w:val="14171C"/>
+          <w:sz w:val="23"/>
+        </w:rPr>
+        <w:t>Interpretive framework: social constructivism, with a post-positivist discipline running underneath it.</w:t>
+      </w:r>
+      <w:r>
+        <w:rPr>
+          <w:rFonts w:ascii="Georgia" w:hAnsi="Georgia" w:cs="Georgia"/>
+          <w:b w:val="0"/>
+          <w:i w:val="0"/>
+          <w:color w:val="14171C"/>
+          <w:sz w:val="23"/>
+        </w:rPr>
+        <w:t xml:space="preserve"> The ontology is constructivist — meaning is made by participants and the researchers build theory upward from it. But the procedures are not loose. The staged design, the systematic first- and second-order coding, and the structured second phase all look like moves borrowed from a post-positivist concern with defensible inference. Table 2.2 sorts these frameworks cleanly; this article sits less cleanly than the table implies.</w:t>
       </w:r>
     </w:p>
     <w:p>
@@ -117,7 +267,7 @@
           <w:color w:val="14171C"/>
           <w:sz w:val="23"/>
         </w:rPr>
-        <w:t>Creswell and Poth ask four questions of any study: what the researcher takes reality to be, what counts as knowledge and how close the researcher stands to it, what part values play, and what procedures follow from those answers. I had answers to all four. I had never stated one of them.</w:t>
+        <w:t>That mixture is the thing I want to take with me. I had assumed a framework was a single label selected before fieldwork. What the article shows is a constructivist ontology paired with procedural rigour ordinarily associated with the other camp — and the rigour is what makes the constructivism credible rather than merely asserted.</w:t>
       </w:r>
     </w:p>
     <w:p>
@@ -133,75 +283,7 @@
           <w:color w:val="14171C"/>
           <w:sz w:val="23"/>
         </w:rPr>
-        <w:t xml:space="preserve">My fifty-five items treated anchoring as a property auditors carry — stable enough to hold still while I measured it, and the same thing in each of them. That is a position on the nature of reality. I did not argue for it. It arrived with the instrument. The design also placed me outside what I was studying: a screener, a scale, a distance. That is a position on knowledge, and it came free with the survey rather than from anything I decided. When the panel returned roughly twenty eligible people out of 334,976, I read it as a sampling problem. The harder reading is that I had committed to a picture of the world in which </w:t>
-      </w:r>
-      <w:r>
-        <w:rPr>
-          <w:rFonts w:ascii="Georgia" w:hAnsi="Georgia" w:cs="Georgia"/>
-          <w:b w:val="0"/>
-          <w:i/>
-          <w:color w:val="14171C"/>
-          <w:sz w:val="23"/>
-        </w:rPr>
-        <w:t>how much anchoring</w:t>
-      </w:r>
-      <w:r>
-        <w:rPr>
-          <w:rFonts w:ascii="Georgia" w:hAnsi="Georgia" w:cs="Georgia"/>
-          <w:b w:val="0"/>
-          <w:i w:val="0"/>
-          <w:color w:val="14171C"/>
-          <w:sz w:val="23"/>
-        </w:rPr>
-        <w:t xml:space="preserve"> is a sensible thing to ask, and then found the world would not hold still for it.</w:t>
-      </w:r>
-    </w:p>
-    <w:p>
-      <w:pPr>
-        <w:spacing w:after="180" w:line="276" w:lineRule="auto"/>
-        <w:jc w:val="both"/>
-      </w:pPr>
-      <w:r>
-        <w:rPr>
-          <w:rFonts w:ascii="Georgia" w:hAnsi="Georgia" w:cs="Georgia"/>
-          <w:b w:val="0"/>
-          <w:i w:val="0"/>
-          <w:color w:val="14171C"/>
-          <w:sz w:val="23"/>
-        </w:rPr>
-        <w:t>Chapter 3 gives that a name. A qualitative design is meant to be emergent — the question, the sampling, and the form of the data are allowed to move as the study learns. Mine could not move. It was fixed the moment I wrote the items, months before a single response arrived, and every decision afterwards was constrained by a commitment I made before I knew anything.</w:t>
-      </w:r>
-    </w:p>
-    <w:p>
-      <w:pPr>
-        <w:spacing w:after="180" w:line="276" w:lineRule="auto"/>
-        <w:jc w:val="both"/>
-      </w:pPr>
-      <w:r>
-        <w:rPr>
-          <w:rFonts w:ascii="Georgia" w:hAnsi="Georgia" w:cs="Georgia"/>
-          <w:b w:val="0"/>
-          <w:i w:val="0"/>
-          <w:color w:val="14171C"/>
-          <w:sz w:val="23"/>
-        </w:rPr>
-        <w:t>Gioia and Chittipeddi (1991) is the contrast that makes this concrete. Their study states its position instead of assuming it: the researchers occupy declared insider and outsider roles, and that arrangement is not a limitation they apologise for but the instrument itself. Their credibility comes from showing the reader the route from what was observed to what is claimed, and inviting judgement on the route. Mine came from a statistic I had not earned.</w:t>
-      </w:r>
-    </w:p>
-    <w:p>
-      <w:pPr>
-        <w:spacing w:after="180" w:line="276" w:lineRule="auto"/>
-        <w:jc w:val="both"/>
-      </w:pPr>
-      <w:r>
-        <w:rPr>
-          <w:rFonts w:ascii="Georgia" w:hAnsi="Georgia" w:cs="Georgia"/>
-          <w:b w:val="0"/>
-          <w:i w:val="0"/>
-          <w:color w:val="14171C"/>
-          <w:sz w:val="23"/>
-        </w:rPr>
-        <w:t xml:space="preserve">This changes what I intend to propose this term. My dissertation extension argues three links — a system-generated figure functioning as an anchor, a model agreeing with a stated position rather than challenging it, and successive systems converging on each other instead of on evidence. The first is a magnitude question and a survey suits it. The second is not a magnitude question at all. Asking </w:t>
+        <w:t xml:space="preserve">This matters directly to my own proposal. My qualifying study committed, without my noticing, to an ontology in which anchoring is a stable property auditors carry and a quantity I could ask </w:t>
       </w:r>
       <w:r>
         <w:rPr>
@@ -221,59 +303,62 @@
           <w:color w:val="14171C"/>
           <w:sz w:val="23"/>
         </w:rPr>
-        <w:t xml:space="preserve"> an auditor defers presumes that deferring is a quantity. Asking </w:t>
+        <w:t xml:space="preserve"> about. I never argued for it; it arrived with the fifty-five-item instrument. If I now want to ask what an auditor understands themselves to be doing when an AI system produces a conclusion before they have formed one, that is a constructivist question, and I will have to state the assumption on the first page rather than let the method smuggle it in again.</w:t>
+      </w:r>
+    </w:p>
+    <w:p>
+      <w:pPr>
+        <w:spacing w:before="280" w:after="60"/>
+        <w:pBdr>
+          <w:bottom w:val="single" w:sz="6" w:space="4" w:color="D8D4CB"/>
+        </w:pBdr>
+      </w:pPr>
+      <w:r>
+        <w:rPr>
+          <w:rFonts w:ascii="Consolas" w:hAnsi="Consolas" w:cs="Consolas"/>
+          <w:b/>
+          <w:i w:val="0"/>
+          <w:caps/>
+          <w:color w:val="767D86"/>
+          <w:sz w:val="16"/>
+          <w:spacing w:val="22"/>
+        </w:rPr>
+        <w:t>Article analysed</w:t>
+      </w:r>
+    </w:p>
+    <w:p>
+      <w:pPr>
+        <w:spacing w:after="100" w:line="264" w:lineRule="auto"/>
+      </w:pPr>
+      <w:r>
+        <w:rPr>
+          <w:rFonts w:ascii="Georgia" w:hAnsi="Georgia" w:cs="Georgia"/>
+          <w:b w:val="0"/>
+          <w:i w:val="0"/>
+          <w:color w:val="767D86"/>
+          <w:sz w:val="18"/>
+        </w:rPr>
+        <w:t xml:space="preserve">Gioia, D. A., &amp; Chittipeddi, K. (1991). Sensemaking and sensegiving in strategic change initiation. </w:t>
       </w:r>
       <w:r>
         <w:rPr>
           <w:rFonts w:ascii="Georgia" w:hAnsi="Georgia" w:cs="Georgia"/>
           <w:b w:val="0"/>
           <w:i/>
-          <w:color w:val="14171C"/>
-          <w:sz w:val="23"/>
+          <w:color w:val="767D86"/>
+          <w:sz w:val="18"/>
         </w:rPr>
-        <w:t>what an auditor understands themselves to be doing</w:t>
+        <w:t>Strategic Management Journal, 12</w:t>
       </w:r>
       <w:r>
         <w:rPr>
           <w:rFonts w:ascii="Georgia" w:hAnsi="Georgia" w:cs="Georgia"/>
           <w:b w:val="0"/>
           <w:i w:val="0"/>
-          <w:color w:val="14171C"/>
-          <w:sz w:val="23"/>
+          <w:color w:val="767D86"/>
+          <w:sz w:val="18"/>
         </w:rPr>
-        <w:t xml:space="preserve"> when the system speaks first presumes nothing, and it is the question I actually want answered.</w:t>
-      </w:r>
-    </w:p>
-    <w:p>
-      <w:pPr>
-        <w:spacing w:after="180" w:line="276" w:lineRule="auto"/>
-        <w:jc w:val="both"/>
-      </w:pPr>
-      <w:r>
-        <w:rPr>
-          <w:rFonts w:ascii="Georgia" w:hAnsi="Georgia" w:cs="Georgia"/>
-          <w:b w:val="0"/>
-          <w:i w:val="0"/>
-          <w:color w:val="14171C"/>
-          <w:sz w:val="23"/>
-        </w:rPr>
-        <w:t>So the proposal I want to write is a phenomenological one, and I want its assumptions stated on the first page rather than smuggled in with the method.</w:t>
-      </w:r>
-    </w:p>
-    <w:p>
-      <w:pPr>
-        <w:spacing w:after="180" w:line="276" w:lineRule="auto"/>
-        <w:jc w:val="both"/>
-      </w:pPr>
-      <w:r>
-        <w:rPr>
-          <w:rFonts w:ascii="Georgia" w:hAnsi="Georgia" w:cs="Georgia"/>
-          <w:b w:val="0"/>
-          <w:i w:val="0"/>
-          <w:color w:val="14171C"/>
-          <w:sz w:val="23"/>
-        </w:rPr>
-        <w:t>I have spent two years being careful inside a frame I never examined. That is the more expensive kind of error, because nothing about it looks like a mistake while it is happening.</w:t>
+        <w:t>(6), 433–448.  (Assigned, Week 1.)</w:t>
       </w:r>
     </w:p>
     <w:p>
@@ -325,54 +410,7 @@
           <w:color w:val="767D86"/>
           <w:sz w:val="18"/>
         </w:rPr>
-        <w:t xml:space="preserve">Suggested wording if it fits the truth: </w:t>
-      </w:r>
-      <w:r>
-        <w:rPr>
-          <w:rFonts w:ascii="Georgia" w:hAnsi="Georgia" w:cs="Georgia"/>
-          <w:b w:val="0"/>
-          <w:i/>
-          <w:color w:val="767D86"/>
-          <w:sz w:val="18"/>
-        </w:rPr>
-        <w:t>“An AI assistant was used to organise my notes and check clarity. The argument, the examples and the conclusions are my own.”</w:t>
-      </w:r>
-    </w:p>
-    <w:p>
-      <w:pPr>
-        <w:spacing w:before="280" w:after="60"/>
-        <w:pBdr>
-          <w:bottom w:val="single" w:sz="6" w:space="4" w:color="D8D4CB"/>
-        </w:pBdr>
-      </w:pPr>
-      <w:r>
-        <w:rPr>
-          <w:rFonts w:ascii="Consolas" w:hAnsi="Consolas" w:cs="Consolas"/>
-          <w:b/>
-          <w:i w:val="0"/>
-          <w:caps/>
-          <w:color w:val="767D86"/>
-          <w:sz w:val="16"/>
-          <w:spacing w:val="22"/>
-        </w:rPr>
-        <w:t>Optional — the article tied to my own proposal topic</w:t>
-      </w:r>
-    </w:p>
-    <w:p>
-      <w:pPr>
-        <w:spacing w:after="100" w:line="264" w:lineRule="auto"/>
-      </w:pPr>
-      <w:r>
-        <w:rPr>
-          <w:rFonts w:ascii="Georgia" w:hAnsi="Georgia" w:cs="Georgia"/>
-          <w:b/>
-          <w:i w:val="0"/>
-          <w:caps/>
-          <w:color w:val="1F4E79"/>
-          <w:sz w:val="18"/>
-          <w:highlight w:val="yellow"/>
-        </w:rPr>
-        <w:t>WEEK 2 ALSO ASKS FOR ONE QUALITATIVE ARTICLE RELATED TO YOUR PROPOSAL TOPIC. IF YOU WANT IT IN, ADD ONE SENTENCE AFTER THE PHENOMENOLOGY PARAGRAPH AND CITE IT HERE. THE MEMO STANDS WITHOUT IT.</w:t>
+        <w:t>Suggested wording if it fits the truth: “An AI assistant was used to organise my notes and check clarity. The argument, the examples and the conclusions are my own.”</w:t>
       </w:r>
     </w:p>
     <w:sectPr>

</xml_diff>